<commit_message>
update: assets tempaltes for docx and pdf generation plus translation missing updated
</commit_message>
<xml_diff>
--- a/assets/templates/fertilizer_application.docx
+++ b/assets/templates/fertilizer_application.docx
@@ -2433,45 +2433,124 @@
         <w:pStyle w:val="Normal"/>
         <w:spacing w:lineRule="auto" w:line="240" w:before="0" w:after="0"/>
         <w:rPr>
-          <w:rFonts w:ascii="Pyidaungsu" w:hAnsi="Pyidaungsu" w:eastAsia="Times New Roman" w:cs="Pyidaungsu"/>
-          <w:sz w:val="24"/>
-          <w:szCs w:val="24"/>
-        </w:rPr>
-      </w:pPr>
-      <w:r>
-        <w:rPr>
-          <w:rFonts w:eastAsia="Times New Roman" w:cs="Pyidaungsu" w:ascii="Pyidaungsu" w:hAnsi="Pyidaungsu"/>
-          <w:sz w:val="24"/>
-          <w:szCs w:val="24"/>
-        </w:rPr>
-      </w:r>
-    </w:p>
-    <w:p>
-      <w:pPr>
-        <w:pStyle w:val="Normal"/>
-        <w:rPr>
-          <w:rFonts w:ascii="Pyidaungsu" w:hAnsi="Pyidaungsu" w:cs="Pyidaungsu"/>
-        </w:rPr>
-      </w:pPr>
-      <w:r>
-        <w:rPr>
-          <w:rFonts w:cs="Pyidaungsu" w:ascii="Pyidaungsu" w:hAnsi="Pyidaungsu"/>
-        </w:rPr>
-      </w:r>
-    </w:p>
-    <w:p>
-      <w:pPr>
-        <w:pStyle w:val="Normal"/>
-        <w:spacing w:before="0" w:after="160"/>
-        <w:jc w:val="right"/>
-        <w:rPr>
-          <w:rFonts w:ascii="Pyidaungsu" w:hAnsi="Pyidaungsu" w:cs="Pyidaungsu"/>
-        </w:rPr>
-      </w:pPr>
-      <w:r>
-        <w:rPr>
-          <w:rFonts w:cs="Pyidaungsu" w:ascii="Pyidaungsu" w:hAnsi="Pyidaungsu"/>
-        </w:rPr>
+          <w:rFonts w:ascii="Pyidaungsu" w:hAnsi="Pyidaungsu" w:cs="Pyidaungsu"/>
+        </w:rPr>
+      </w:pPr>
+      <w:r>
+        <w:rPr/>
+      </w:r>
+    </w:p>
+    <w:p>
+      <w:pPr>
+        <w:pStyle w:val="Normal"/>
+        <w:spacing w:lineRule="auto" w:line="240" w:before="0" w:after="0"/>
+        <w:rPr>
+          <w:rFonts w:ascii="Pyidaungsu" w:hAnsi="Pyidaungsu" w:cs="Pyidaungsu"/>
+        </w:rPr>
+      </w:pPr>
+      <w:r>
+        <w:rPr/>
+      </w:r>
+    </w:p>
+    <w:p>
+      <w:pPr>
+        <w:pStyle w:val="Normal"/>
+        <w:spacing w:lineRule="auto" w:line="240" w:before="0" w:after="0"/>
+        <w:rPr>
+          <w:rFonts w:ascii="Pyidaungsu" w:hAnsi="Pyidaungsu" w:cs="Pyidaungsu"/>
+        </w:rPr>
+      </w:pPr>
+      <w:r>
+        <w:rPr/>
+      </w:r>
+    </w:p>
+    <w:p>
+      <w:pPr>
+        <w:pStyle w:val="Normal"/>
+        <w:spacing w:lineRule="auto" w:line="240" w:before="0" w:after="0"/>
+        <w:rPr>
+          <w:rFonts w:ascii="Pyidaungsu" w:hAnsi="Pyidaungsu" w:cs="Pyidaungsu"/>
+        </w:rPr>
+      </w:pPr>
+      <w:r>
+        <w:rPr/>
+      </w:r>
+    </w:p>
+    <w:p>
+      <w:pPr>
+        <w:pStyle w:val="Normal"/>
+        <w:spacing w:lineRule="auto" w:line="240" w:before="0" w:after="0"/>
+        <w:rPr>
+          <w:rFonts w:ascii="Pyidaungsu" w:hAnsi="Pyidaungsu" w:cs="Pyidaungsu"/>
+        </w:rPr>
+      </w:pPr>
+      <w:r>
+        <w:rPr/>
+      </w:r>
+    </w:p>
+    <w:p>
+      <w:pPr>
+        <w:pStyle w:val="Normal"/>
+        <w:spacing w:lineRule="auto" w:line="240" w:before="0" w:after="0"/>
+        <w:jc w:val="center"/>
+        <w:rPr/>
+      </w:pPr>
+      <w:r>
+        <w:rPr>
+          <w:rFonts w:eastAsia="Times New Roman" w:cs="Pyidaungsu" w:ascii="Pyidaungsu" w:hAnsi="Pyidaungsu"/>
+          <w:sz w:val="24"/>
+          <w:szCs w:val="24"/>
+        </w:rPr>
+        <w:t>${nrc_front}</w:t>
+      </w:r>
+    </w:p>
+    <w:p>
+      <w:pPr>
+        <w:pStyle w:val="Normal"/>
+        <w:spacing w:lineRule="auto" w:line="240" w:before="0" w:after="0"/>
+        <w:jc w:val="center"/>
+        <w:rPr/>
+      </w:pPr>
+      <w:r>
+        <w:rPr/>
+      </w:r>
+    </w:p>
+    <w:p>
+      <w:pPr>
+        <w:pStyle w:val="Normal"/>
+        <w:spacing w:lineRule="auto" w:line="240" w:before="0" w:after="0"/>
+        <w:jc w:val="center"/>
+        <w:rPr/>
+      </w:pPr>
+      <w:r>
+        <w:rPr/>
+      </w:r>
+    </w:p>
+    <w:p>
+      <w:pPr>
+        <w:pStyle w:val="Normal"/>
+        <w:spacing w:lineRule="auto" w:line="240" w:before="0" w:after="0"/>
+        <w:jc w:val="center"/>
+        <w:rPr/>
+      </w:pPr>
+      <w:r>
+        <w:rPr/>
+      </w:r>
+    </w:p>
+    <w:p>
+      <w:pPr>
+        <w:pStyle w:val="Normal"/>
+        <w:spacing w:lineRule="auto" w:line="240" w:before="0" w:after="0"/>
+        <w:jc w:val="center"/>
+        <w:rPr/>
+      </w:pPr>
+      <w:r>
+        <w:rPr>
+          <w:rFonts w:eastAsia="Times New Roman" w:cs="Pyidaungsu" w:ascii="Pyidaungsu" w:hAnsi="Pyidaungsu"/>
+          <w:sz w:val="24"/>
+          <w:szCs w:val="24"/>
+        </w:rPr>
+        <w:t>${nrc_end}</w:t>
       </w:r>
     </w:p>
     <w:sectPr>
@@ -3004,6 +3083,13 @@
     </w:pPr>
     <w:rPr/>
   </w:style>
+  <w:style w:type="paragraph" w:styleId="FrameContents">
+    <w:name w:val="Frame Contents"/>
+    <w:basedOn w:val="Normal"/>
+    <w:qFormat/>
+    <w:pPr/>
+    <w:rPr/>
+  </w:style>
   <w:style w:type="numbering" w:styleId="NoList" w:default="1">
     <w:name w:val="No List"/>
     <w:uiPriority w:val="99"/>

</xml_diff>